<commit_message>
add insertion sort algos
</commit_message>
<xml_diff>
--- a/Notes.docx
+++ b/Notes.docx
@@ -181,25 +181,7 @@
           <w:sz w:val="22"/>
           <w:szCs w:val="22"/>
         </w:rPr>
-        <w:t xml:space="preserve"> has complexity of O(n) which means it grows linearly. </w:t>
-      </w:r>
-      <w:proofErr w:type="gramStart"/>
-      <w:r>
-        <w:rPr>
-          <w:color w:val="000000" w:themeColor="text1"/>
-          <w:sz w:val="22"/>
-          <w:szCs w:val="22"/>
-        </w:rPr>
-        <w:t>So</w:t>
-      </w:r>
-      <w:proofErr w:type="gramEnd"/>
-      <w:r>
-        <w:rPr>
-          <w:color w:val="000000" w:themeColor="text1"/>
-          <w:sz w:val="22"/>
-          <w:szCs w:val="22"/>
-        </w:rPr>
-        <w:t xml:space="preserve"> if n = 10, it has 10 steps.</w:t>
+        <w:t xml:space="preserve"> has complexity of O(n) which means it grows linearly. So if n = 10, it has 10 steps.</w:t>
       </w:r>
     </w:p>
     <w:p>
@@ -252,27 +234,9 @@
           <w:sz w:val="22"/>
           <w:szCs w:val="22"/>
         </w:rPr>
-        <w:t xml:space="preserve"> Has complexity of </w:t>
-      </w:r>
-      <w:proofErr w:type="gramStart"/>
-      <w:r>
-        <w:rPr>
-          <w:color w:val="000000" w:themeColor="text1"/>
-          <w:sz w:val="22"/>
-          <w:szCs w:val="22"/>
-        </w:rPr>
-        <w:t>O(</w:t>
-      </w:r>
-      <w:proofErr w:type="gramEnd"/>
-      <w:r>
-        <w:rPr>
-          <w:color w:val="000000" w:themeColor="text1"/>
-          <w:sz w:val="22"/>
-          <w:szCs w:val="22"/>
-        </w:rPr>
-        <w:t xml:space="preserve">log n) which means it grows slower. The idea cannot be implemented unless we are working with a sorted array. The main idea is to have a left most, right most, middle. And target. We calculate the target with (left + right) / 2. And check if this mid is equal to our target. If </w:t>
-      </w:r>
-      <w:proofErr w:type="gramStart"/>
+        <w:t xml:space="preserve"> Has complexity of O(log n) which means it grows slower. The idea cannot be implemented unless we are working with a sorted array. The main idea is to have a left most, right most, middle. And target. We calculate the target with (left + right) / 2. And check if this mid is equal to our target. If </w:t>
+      </w:r>
+      <w:proofErr w:type="spellStart"/>
       <w:r>
         <w:rPr>
           <w:color w:val="000000" w:themeColor="text1"/>
@@ -281,16 +245,361 @@
         </w:rPr>
         <w:t>its</w:t>
       </w:r>
-      <w:proofErr w:type="gramEnd"/>
-      <w:r>
-        <w:rPr>
-          <w:color w:val="000000" w:themeColor="text1"/>
-          <w:sz w:val="22"/>
-          <w:szCs w:val="22"/>
-        </w:rPr>
-        <w:t xml:space="preserve"> we end the algo. If </w:t>
-      </w:r>
-      <w:proofErr w:type="gramStart"/>
+      <w:proofErr w:type="spellEnd"/>
+      <w:r>
+        <w:rPr>
+          <w:color w:val="000000" w:themeColor="text1"/>
+          <w:sz w:val="22"/>
+          <w:szCs w:val="22"/>
+        </w:rPr>
+        <w:t xml:space="preserve"> we end the algo. If its smaller than our target, it becomes our left  and our right stays the same. if its greater it becomes our right and our left stays the same and repeat.</w:t>
+      </w:r>
+    </w:p>
+    <w:p>
+      <w:pPr>
+        <w:rPr>
+          <w:color w:val="000000" w:themeColor="text1"/>
+          <w:sz w:val="22"/>
+          <w:szCs w:val="22"/>
+        </w:rPr>
+      </w:pPr>
+    </w:p>
+    <w:p>
+      <w:pPr>
+        <w:rPr>
+          <w:b/>
+          <w:bCs/>
+          <w:color w:val="000000" w:themeColor="text1"/>
+          <w:sz w:val="22"/>
+          <w:szCs w:val="22"/>
+          <w:u w:val="single"/>
+        </w:rPr>
+      </w:pPr>
+      <w:r>
+        <w:rPr>
+          <w:b/>
+          <w:bCs/>
+          <w:color w:val="000000" w:themeColor="text1"/>
+          <w:sz w:val="22"/>
+          <w:szCs w:val="22"/>
+          <w:u w:val="single"/>
+        </w:rPr>
+        <w:t>Types of big O and their meanings:</w:t>
+      </w:r>
+    </w:p>
+    <w:p>
+      <w:pPr>
+        <w:rPr>
+          <w:b/>
+          <w:bCs/>
+          <w:color w:val="000000" w:themeColor="text1"/>
+          <w:sz w:val="22"/>
+          <w:szCs w:val="22"/>
+        </w:rPr>
+      </w:pPr>
+      <w:r>
+        <w:rPr>
+          <w:b/>
+          <w:bCs/>
+          <w:color w:val="000000" w:themeColor="text1"/>
+          <w:sz w:val="22"/>
+          <w:szCs w:val="22"/>
+        </w:rPr>
+        <w:t>O(1)</w:t>
+      </w:r>
+      <w:r>
+        <w:rPr>
+          <w:b/>
+          <w:bCs/>
+          <w:color w:val="000000" w:themeColor="text1"/>
+          <w:sz w:val="22"/>
+          <w:szCs w:val="22"/>
+        </w:rPr>
+        <w:t xml:space="preserve">: </w:t>
+      </w:r>
+      <w:r>
+        <w:rPr>
+          <w:b/>
+          <w:bCs/>
+          <w:color w:val="000000" w:themeColor="text1"/>
+          <w:sz w:val="22"/>
+          <w:szCs w:val="22"/>
+        </w:rPr>
+        <w:t>Constant time</w:t>
+      </w:r>
+    </w:p>
+    <w:p>
+      <w:pPr>
+        <w:rPr>
+          <w:b/>
+          <w:bCs/>
+          <w:color w:val="000000" w:themeColor="text1"/>
+          <w:sz w:val="22"/>
+          <w:szCs w:val="22"/>
+        </w:rPr>
+      </w:pPr>
+      <w:r>
+        <w:rPr>
+          <w:b/>
+          <w:bCs/>
+          <w:color w:val="000000" w:themeColor="text1"/>
+          <w:sz w:val="22"/>
+          <w:szCs w:val="22"/>
+        </w:rPr>
+        <w:t>O(log n)</w:t>
+      </w:r>
+      <w:r>
+        <w:rPr>
+          <w:b/>
+          <w:bCs/>
+          <w:color w:val="000000" w:themeColor="text1"/>
+          <w:sz w:val="22"/>
+          <w:szCs w:val="22"/>
+        </w:rPr>
+        <w:t>: logarithmic time</w:t>
+      </w:r>
+    </w:p>
+    <w:p>
+      <w:pPr>
+        <w:rPr>
+          <w:b/>
+          <w:bCs/>
+          <w:color w:val="000000" w:themeColor="text1"/>
+          <w:sz w:val="22"/>
+          <w:szCs w:val="22"/>
+        </w:rPr>
+      </w:pPr>
+      <w:r>
+        <w:rPr>
+          <w:b/>
+          <w:bCs/>
+          <w:color w:val="000000" w:themeColor="text1"/>
+          <w:sz w:val="22"/>
+          <w:szCs w:val="22"/>
+        </w:rPr>
+        <w:t>O(n)</w:t>
+      </w:r>
+      <w:r>
+        <w:rPr>
+          <w:b/>
+          <w:bCs/>
+          <w:color w:val="000000" w:themeColor="text1"/>
+          <w:sz w:val="22"/>
+          <w:szCs w:val="22"/>
+        </w:rPr>
+        <w:t xml:space="preserve">: linear </w:t>
+      </w:r>
+    </w:p>
+    <w:p>
+      <w:pPr>
+        <w:rPr>
+          <w:b/>
+          <w:bCs/>
+          <w:color w:val="000000" w:themeColor="text1"/>
+          <w:sz w:val="22"/>
+          <w:szCs w:val="22"/>
+        </w:rPr>
+      </w:pPr>
+      <w:r>
+        <w:rPr>
+          <w:b/>
+          <w:bCs/>
+          <w:color w:val="000000" w:themeColor="text1"/>
+          <w:sz w:val="22"/>
+          <w:szCs w:val="22"/>
+        </w:rPr>
+        <w:t>O(n log n)</w:t>
+      </w:r>
+      <w:r>
+        <w:rPr>
+          <w:b/>
+          <w:bCs/>
+          <w:color w:val="000000" w:themeColor="text1"/>
+          <w:sz w:val="22"/>
+          <w:szCs w:val="22"/>
+        </w:rPr>
+        <w:t xml:space="preserve">: </w:t>
+      </w:r>
+      <w:proofErr w:type="spellStart"/>
+      <w:r>
+        <w:rPr>
+          <w:b/>
+          <w:bCs/>
+          <w:color w:val="000000" w:themeColor="text1"/>
+          <w:sz w:val="22"/>
+          <w:szCs w:val="22"/>
+        </w:rPr>
+        <w:t>linearathmatic</w:t>
+      </w:r>
+      <w:proofErr w:type="spellEnd"/>
+      <w:r>
+        <w:rPr>
+          <w:b/>
+          <w:bCs/>
+          <w:color w:val="000000" w:themeColor="text1"/>
+          <w:sz w:val="22"/>
+          <w:szCs w:val="22"/>
+        </w:rPr>
+        <w:t xml:space="preserve"> time</w:t>
+      </w:r>
+    </w:p>
+    <w:p>
+      <w:pPr>
+        <w:rPr>
+          <w:b/>
+          <w:bCs/>
+          <w:color w:val="000000" w:themeColor="text1"/>
+          <w:sz w:val="22"/>
+          <w:szCs w:val="22"/>
+        </w:rPr>
+      </w:pPr>
+      <w:r>
+        <w:rPr>
+          <w:b/>
+          <w:bCs/>
+          <w:color w:val="000000" w:themeColor="text1"/>
+          <w:sz w:val="22"/>
+          <w:szCs w:val="22"/>
+        </w:rPr>
+        <w:t>O(n2)</w:t>
+      </w:r>
+      <w:r>
+        <w:rPr>
+          <w:b/>
+          <w:bCs/>
+          <w:color w:val="000000" w:themeColor="text1"/>
+          <w:sz w:val="22"/>
+          <w:szCs w:val="22"/>
+        </w:rPr>
+        <w:t xml:space="preserve">: Quadratic </w:t>
+      </w:r>
+    </w:p>
+    <w:p>
+      <w:pPr>
+        <w:rPr>
+          <w:b/>
+          <w:bCs/>
+          <w:color w:val="000000" w:themeColor="text1"/>
+          <w:sz w:val="22"/>
+          <w:szCs w:val="22"/>
+        </w:rPr>
+      </w:pPr>
+      <w:r>
+        <w:rPr>
+          <w:b/>
+          <w:bCs/>
+          <w:color w:val="000000" w:themeColor="text1"/>
+          <w:sz w:val="22"/>
+          <w:szCs w:val="22"/>
+        </w:rPr>
+        <w:t>O(2n)</w:t>
+      </w:r>
+      <w:r>
+        <w:rPr>
+          <w:b/>
+          <w:bCs/>
+          <w:color w:val="000000" w:themeColor="text1"/>
+          <w:sz w:val="22"/>
+          <w:szCs w:val="22"/>
+        </w:rPr>
+        <w:t xml:space="preserve">: Exponential </w:t>
+      </w:r>
+    </w:p>
+    <w:p>
+      <w:pPr>
+        <w:rPr>
+          <w:b/>
+          <w:bCs/>
+          <w:color w:val="000000" w:themeColor="text1"/>
+          <w:sz w:val="22"/>
+          <w:szCs w:val="22"/>
+        </w:rPr>
+      </w:pPr>
+      <w:r>
+        <w:rPr>
+          <w:b/>
+          <w:bCs/>
+          <w:color w:val="000000" w:themeColor="text1"/>
+          <w:sz w:val="22"/>
+          <w:szCs w:val="22"/>
+        </w:rPr>
+        <w:t>O(n!)</w:t>
+      </w:r>
+      <w:r>
+        <w:rPr>
+          <w:b/>
+          <w:bCs/>
+          <w:color w:val="000000" w:themeColor="text1"/>
+          <w:sz w:val="22"/>
+          <w:szCs w:val="22"/>
+        </w:rPr>
+        <w:t>: Factorial</w:t>
+      </w:r>
+    </w:p>
+    <w:p>
+      <w:pPr>
+        <w:jc w:val="center"/>
+        <w:rPr>
+          <w:b/>
+          <w:bCs/>
+          <w:color w:val="EE0000"/>
+          <w:sz w:val="32"/>
+          <w:szCs w:val="32"/>
+          <w:u w:val="single"/>
+        </w:rPr>
+      </w:pPr>
+    </w:p>
+    <w:p>
+      <w:pPr>
+        <w:jc w:val="center"/>
+        <w:rPr>
+          <w:b/>
+          <w:bCs/>
+          <w:color w:val="EE0000"/>
+          <w:sz w:val="32"/>
+          <w:szCs w:val="32"/>
+          <w:u w:val="single"/>
+        </w:rPr>
+      </w:pPr>
+      <w:r>
+        <w:rPr>
+          <w:b/>
+          <w:bCs/>
+          <w:color w:val="EE0000"/>
+          <w:sz w:val="32"/>
+          <w:szCs w:val="32"/>
+          <w:u w:val="single"/>
+        </w:rPr>
+        <w:t>Bubble sort</w:t>
+      </w:r>
+    </w:p>
+    <w:p>
+      <w:pPr>
+        <w:rPr>
+          <w:color w:val="000000" w:themeColor="text1"/>
+          <w:sz w:val="22"/>
+          <w:szCs w:val="22"/>
+        </w:rPr>
+      </w:pPr>
+      <w:proofErr w:type="spellStart"/>
+      <w:r>
+        <w:rPr>
+          <w:color w:val="000000" w:themeColor="text1"/>
+          <w:sz w:val="22"/>
+          <w:szCs w:val="22"/>
+        </w:rPr>
+        <w:t>Its</w:t>
+      </w:r>
+      <w:proofErr w:type="spellEnd"/>
+      <w:r>
+        <w:rPr>
+          <w:color w:val="000000" w:themeColor="text1"/>
+          <w:sz w:val="22"/>
+          <w:szCs w:val="22"/>
+        </w:rPr>
+        <w:t xml:space="preserve"> not time efficient but </w:t>
+      </w:r>
+      <w:proofErr w:type="spellStart"/>
       <w:r>
         <w:rPr>
           <w:color w:val="000000" w:themeColor="text1"/>
@@ -299,51 +608,85 @@
         </w:rPr>
         <w:t>its</w:t>
       </w:r>
-      <w:proofErr w:type="gramEnd"/>
-      <w:r>
-        <w:rPr>
-          <w:color w:val="000000" w:themeColor="text1"/>
-          <w:sz w:val="22"/>
-          <w:szCs w:val="22"/>
-        </w:rPr>
-        <w:t xml:space="preserve"> smaller than our target, it becomes our </w:t>
-      </w:r>
-      <w:proofErr w:type="gramStart"/>
-      <w:r>
-        <w:rPr>
-          <w:color w:val="000000" w:themeColor="text1"/>
-          <w:sz w:val="22"/>
-          <w:szCs w:val="22"/>
-        </w:rPr>
-        <w:t>left  and</w:t>
-      </w:r>
-      <w:proofErr w:type="gramEnd"/>
-      <w:r>
-        <w:rPr>
-          <w:color w:val="000000" w:themeColor="text1"/>
-          <w:sz w:val="22"/>
-          <w:szCs w:val="22"/>
-        </w:rPr>
-        <w:t xml:space="preserve"> our right stays the same. if its greater it becomes our right and our left stays the same and repeat.</w:t>
-      </w:r>
-    </w:p>
-    <w:p>
-      <w:pPr>
-        <w:rPr>
-          <w:color w:val="000000" w:themeColor="text1"/>
-          <w:sz w:val="22"/>
-          <w:szCs w:val="22"/>
-        </w:rPr>
-      </w:pPr>
-    </w:p>
-    <w:p>
-      <w:pPr>
-        <w:rPr>
-          <w:b/>
-          <w:bCs/>
-          <w:color w:val="000000" w:themeColor="text1"/>
-          <w:sz w:val="22"/>
-          <w:szCs w:val="22"/>
+      <w:proofErr w:type="spellEnd"/>
+      <w:r>
+        <w:rPr>
+          <w:color w:val="000000" w:themeColor="text1"/>
+          <w:sz w:val="22"/>
+          <w:szCs w:val="22"/>
+        </w:rPr>
+        <w:t xml:space="preserve"> very simple to understand</w:t>
+      </w:r>
+    </w:p>
+    <w:p>
+      <w:pPr>
+        <w:rPr>
+          <w:color w:val="000000" w:themeColor="text1"/>
+          <w:sz w:val="22"/>
+          <w:szCs w:val="22"/>
+        </w:rPr>
+      </w:pPr>
+      <w:r>
+        <w:rPr>
+          <w:color w:val="000000" w:themeColor="text1"/>
+          <w:sz w:val="22"/>
+          <w:szCs w:val="22"/>
+        </w:rPr>
+        <w:t>It has the time complexity of O(n</w:t>
+      </w:r>
+      <w:r>
+        <w:rPr>
+          <w:color w:val="000000" w:themeColor="text1"/>
+          <w:sz w:val="22"/>
+          <w:szCs w:val="22"/>
+          <w:vertAlign w:val="superscript"/>
+        </w:rPr>
+        <w:t xml:space="preserve">2 </w:t>
+      </w:r>
+      <w:r>
+        <w:rPr>
+          <w:color w:val="000000" w:themeColor="text1"/>
+          <w:sz w:val="22"/>
+          <w:szCs w:val="22"/>
+        </w:rPr>
+        <w:t xml:space="preserve">) </w:t>
+      </w:r>
+    </w:p>
+    <w:p>
+      <w:pPr>
+        <w:rPr>
+          <w:color w:val="000000" w:themeColor="text1"/>
+          <w:sz w:val="22"/>
+          <w:szCs w:val="22"/>
+        </w:rPr>
+      </w:pPr>
+      <w:r>
+        <w:rPr>
+          <w:color w:val="000000" w:themeColor="text1"/>
+          <w:sz w:val="22"/>
+          <w:szCs w:val="22"/>
+        </w:rPr>
+        <w:t>The main idea is to compare each 2 consecutive elements and swap them until when we compare each 2 elements in the array there is no swapping happening and this is the end.</w:t>
+      </w:r>
+    </w:p>
+    <w:p>
+      <w:pPr>
+        <w:rPr>
+          <w:color w:val="000000" w:themeColor="text1"/>
+          <w:sz w:val="22"/>
+          <w:szCs w:val="22"/>
+        </w:rPr>
+      </w:pPr>
+    </w:p>
+    <w:p>
+      <w:pPr>
+        <w:jc w:val="center"/>
+        <w:rPr>
+          <w:b/>
+          <w:bCs/>
+          <w:color w:val="EE0000"/>
+          <w:sz w:val="32"/>
+          <w:szCs w:val="32"/>
           <w:u w:val="single"/>
         </w:rPr>
       </w:pPr>
@@ -351,416 +694,151 @@
         <w:rPr>
           <w:b/>
           <w:bCs/>
-          <w:color w:val="000000" w:themeColor="text1"/>
-          <w:sz w:val="22"/>
-          <w:szCs w:val="22"/>
+          <w:color w:val="EE0000"/>
+          <w:sz w:val="32"/>
+          <w:szCs w:val="32"/>
           <w:u w:val="single"/>
         </w:rPr>
-        <w:t>Types of big O and their meanings:</w:t>
-      </w:r>
-    </w:p>
-    <w:p>
-      <w:pPr>
-        <w:rPr>
-          <w:b/>
-          <w:bCs/>
-          <w:color w:val="000000" w:themeColor="text1"/>
-          <w:sz w:val="22"/>
-          <w:szCs w:val="22"/>
-        </w:rPr>
-      </w:pPr>
-      <w:proofErr w:type="gramStart"/>
-      <w:r>
-        <w:rPr>
-          <w:b/>
-          <w:bCs/>
-          <w:color w:val="000000" w:themeColor="text1"/>
-          <w:sz w:val="22"/>
-          <w:szCs w:val="22"/>
-        </w:rPr>
-        <w:t>O(</w:t>
-      </w:r>
-      <w:proofErr w:type="gramEnd"/>
-      <w:r>
-        <w:rPr>
-          <w:b/>
-          <w:bCs/>
-          <w:color w:val="000000" w:themeColor="text1"/>
-          <w:sz w:val="22"/>
-          <w:szCs w:val="22"/>
-        </w:rPr>
-        <w:t>1)</w:t>
-      </w:r>
-      <w:r>
-        <w:rPr>
-          <w:b/>
-          <w:bCs/>
-          <w:color w:val="000000" w:themeColor="text1"/>
-          <w:sz w:val="22"/>
-          <w:szCs w:val="22"/>
-        </w:rPr>
-        <w:t xml:space="preserve">: </w:t>
-      </w:r>
-      <w:r>
-        <w:rPr>
-          <w:b/>
-          <w:bCs/>
-          <w:color w:val="000000" w:themeColor="text1"/>
-          <w:sz w:val="22"/>
-          <w:szCs w:val="22"/>
-        </w:rPr>
-        <w:t>Constant time</w:t>
-      </w:r>
-    </w:p>
-    <w:p>
-      <w:pPr>
-        <w:rPr>
-          <w:b/>
-          <w:bCs/>
-          <w:color w:val="000000" w:themeColor="text1"/>
-          <w:sz w:val="22"/>
-          <w:szCs w:val="22"/>
-        </w:rPr>
-      </w:pPr>
-      <w:proofErr w:type="gramStart"/>
-      <w:r>
-        <w:rPr>
-          <w:b/>
-          <w:bCs/>
-          <w:color w:val="000000" w:themeColor="text1"/>
-          <w:sz w:val="22"/>
-          <w:szCs w:val="22"/>
-        </w:rPr>
-        <w:t>O(</w:t>
-      </w:r>
-      <w:proofErr w:type="gramEnd"/>
-      <w:r>
-        <w:rPr>
-          <w:b/>
-          <w:bCs/>
-          <w:color w:val="000000" w:themeColor="text1"/>
-          <w:sz w:val="22"/>
-          <w:szCs w:val="22"/>
-        </w:rPr>
-        <w:t>log n</w:t>
-      </w:r>
-      <w:r>
-        <w:rPr>
-          <w:b/>
-          <w:bCs/>
+        <w:t>Selection sort</w:t>
+      </w:r>
+    </w:p>
+    <w:p>
+      <w:pPr>
+        <w:rPr>
+          <w:color w:val="000000" w:themeColor="text1"/>
+          <w:sz w:val="22"/>
+          <w:szCs w:val="22"/>
+        </w:rPr>
+      </w:pPr>
+      <w:r>
+        <w:rPr>
+          <w:color w:val="000000" w:themeColor="text1"/>
+          <w:sz w:val="22"/>
+          <w:szCs w:val="22"/>
+        </w:rPr>
+        <w:t>It also has the time complexity of O(n</w:t>
+      </w:r>
+      <w:r>
+        <w:rPr>
+          <w:color w:val="000000" w:themeColor="text1"/>
+          <w:sz w:val="22"/>
+          <w:szCs w:val="22"/>
+          <w:vertAlign w:val="superscript"/>
+        </w:rPr>
+        <w:t xml:space="preserve">2 </w:t>
+      </w:r>
+      <w:r>
+        <w:rPr>
+          <w:color w:val="000000" w:themeColor="text1"/>
+          <w:sz w:val="22"/>
+          <w:szCs w:val="22"/>
+        </w:rPr>
+        <w:t xml:space="preserve">) </w:t>
+      </w:r>
+    </w:p>
+    <w:p>
+      <w:pPr>
+        <w:rPr>
+          <w:color w:val="000000" w:themeColor="text1"/>
+          <w:sz w:val="22"/>
+          <w:szCs w:val="22"/>
+        </w:rPr>
+      </w:pPr>
+      <w:r>
+        <w:rPr>
+          <w:color w:val="000000" w:themeColor="text1"/>
+          <w:sz w:val="22"/>
+          <w:szCs w:val="22"/>
+        </w:rPr>
+        <w:t>It works by selecting the smallest number each iteration. And remembering its index so we can swap it with our current position then afterwards we can increase to the next index forward.</w:t>
+      </w:r>
+    </w:p>
+    <w:p>
+      <w:pPr>
+        <w:rPr>
+          <w:b/>
+          <w:bCs/>
+          <w:color w:val="EE0000"/>
+          <w:sz w:val="32"/>
+          <w:szCs w:val="32"/>
+          <w:u w:val="single"/>
+        </w:rPr>
+      </w:pPr>
+    </w:p>
+    <w:p>
+      <w:pPr>
+        <w:jc w:val="center"/>
+        <w:rPr>
+          <w:b/>
+          <w:bCs/>
+          <w:color w:val="EE0000"/>
+          <w:sz w:val="32"/>
+          <w:szCs w:val="32"/>
+          <w:u w:val="single"/>
+        </w:rPr>
+      </w:pPr>
+      <w:r>
+        <w:rPr>
+          <w:b/>
+          <w:bCs/>
+          <w:color w:val="EE0000"/>
+          <w:sz w:val="32"/>
+          <w:szCs w:val="32"/>
+          <w:u w:val="single"/>
+        </w:rPr>
+        <w:t>Insertion Sort</w:t>
+      </w:r>
+    </w:p>
+    <w:p>
+      <w:pPr>
+        <w:rPr>
+          <w:color w:val="000000" w:themeColor="text1"/>
+          <w:sz w:val="22"/>
+          <w:szCs w:val="22"/>
+        </w:rPr>
+      </w:pPr>
+      <w:r>
+        <w:rPr>
+          <w:color w:val="000000" w:themeColor="text1"/>
+          <w:sz w:val="22"/>
+          <w:szCs w:val="22"/>
+        </w:rPr>
+        <w:t>it has the complexity of O(n</w:t>
+      </w:r>
+      <w:r>
+        <w:rPr>
+          <w:color w:val="000000" w:themeColor="text1"/>
+          <w:sz w:val="22"/>
+          <w:szCs w:val="22"/>
+          <w:vertAlign w:val="superscript"/>
+        </w:rPr>
+        <w:t>2</w:t>
+      </w:r>
+      <w:r>
+        <w:rPr>
           <w:color w:val="000000" w:themeColor="text1"/>
           <w:sz w:val="22"/>
           <w:szCs w:val="22"/>
         </w:rPr>
         <w:t>)</w:t>
       </w:r>
-      <w:r>
-        <w:rPr>
-          <w:b/>
-          <w:bCs/>
-          <w:color w:val="000000" w:themeColor="text1"/>
-          <w:sz w:val="22"/>
-          <w:szCs w:val="22"/>
-        </w:rPr>
-        <w:t>: logarithmic time</w:t>
-      </w:r>
-    </w:p>
-    <w:p>
-      <w:pPr>
-        <w:rPr>
-          <w:b/>
-          <w:bCs/>
-          <w:color w:val="000000" w:themeColor="text1"/>
-          <w:sz w:val="22"/>
-          <w:szCs w:val="22"/>
-        </w:rPr>
-      </w:pPr>
-      <w:r>
-        <w:rPr>
-          <w:b/>
-          <w:bCs/>
-          <w:color w:val="000000" w:themeColor="text1"/>
-          <w:sz w:val="22"/>
-          <w:szCs w:val="22"/>
-        </w:rPr>
-        <w:t>O(</w:t>
-      </w:r>
-      <w:r>
-        <w:rPr>
-          <w:b/>
-          <w:bCs/>
-          <w:color w:val="000000" w:themeColor="text1"/>
-          <w:sz w:val="22"/>
-          <w:szCs w:val="22"/>
-        </w:rPr>
-        <w:t>n</w:t>
-      </w:r>
-      <w:r>
-        <w:rPr>
-          <w:b/>
-          <w:bCs/>
-          <w:color w:val="000000" w:themeColor="text1"/>
-          <w:sz w:val="22"/>
-          <w:szCs w:val="22"/>
-        </w:rPr>
-        <w:t>)</w:t>
-      </w:r>
-      <w:r>
-        <w:rPr>
-          <w:b/>
-          <w:bCs/>
-          <w:color w:val="000000" w:themeColor="text1"/>
-          <w:sz w:val="22"/>
-          <w:szCs w:val="22"/>
-        </w:rPr>
-        <w:t xml:space="preserve">: linear </w:t>
-      </w:r>
-    </w:p>
-    <w:p>
-      <w:pPr>
-        <w:rPr>
-          <w:b/>
-          <w:bCs/>
-          <w:color w:val="000000" w:themeColor="text1"/>
-          <w:sz w:val="22"/>
-          <w:szCs w:val="22"/>
-        </w:rPr>
-      </w:pPr>
-      <w:proofErr w:type="gramStart"/>
-      <w:r>
-        <w:rPr>
-          <w:b/>
-          <w:bCs/>
-          <w:color w:val="000000" w:themeColor="text1"/>
-          <w:sz w:val="22"/>
-          <w:szCs w:val="22"/>
-        </w:rPr>
-        <w:t>O(</w:t>
-      </w:r>
-      <w:proofErr w:type="gramEnd"/>
-      <w:r>
-        <w:rPr>
-          <w:b/>
-          <w:bCs/>
-          <w:color w:val="000000" w:themeColor="text1"/>
-          <w:sz w:val="22"/>
-          <w:szCs w:val="22"/>
-        </w:rPr>
-        <w:t>n log n</w:t>
-      </w:r>
-      <w:r>
-        <w:rPr>
-          <w:b/>
-          <w:bCs/>
-          <w:color w:val="000000" w:themeColor="text1"/>
-          <w:sz w:val="22"/>
-          <w:szCs w:val="22"/>
-        </w:rPr>
-        <w:t>)</w:t>
-      </w:r>
-      <w:r>
-        <w:rPr>
-          <w:b/>
-          <w:bCs/>
-          <w:color w:val="000000" w:themeColor="text1"/>
-          <w:sz w:val="22"/>
-          <w:szCs w:val="22"/>
-        </w:rPr>
-        <w:t xml:space="preserve">: </w:t>
-      </w:r>
-      <w:proofErr w:type="spellStart"/>
-      <w:r>
-        <w:rPr>
-          <w:b/>
-          <w:bCs/>
-          <w:color w:val="000000" w:themeColor="text1"/>
-          <w:sz w:val="22"/>
-          <w:szCs w:val="22"/>
-        </w:rPr>
-        <w:t>linearathmatic</w:t>
-      </w:r>
-      <w:proofErr w:type="spellEnd"/>
-      <w:r>
-        <w:rPr>
-          <w:b/>
-          <w:bCs/>
-          <w:color w:val="000000" w:themeColor="text1"/>
-          <w:sz w:val="22"/>
-          <w:szCs w:val="22"/>
-        </w:rPr>
-        <w:t xml:space="preserve"> time</w:t>
-      </w:r>
-    </w:p>
-    <w:p>
-      <w:pPr>
-        <w:rPr>
-          <w:b/>
-          <w:bCs/>
-          <w:color w:val="000000" w:themeColor="text1"/>
-          <w:sz w:val="22"/>
-          <w:szCs w:val="22"/>
-        </w:rPr>
-      </w:pPr>
-      <w:r>
-        <w:rPr>
-          <w:b/>
-          <w:bCs/>
-          <w:color w:val="000000" w:themeColor="text1"/>
-          <w:sz w:val="22"/>
-          <w:szCs w:val="22"/>
-        </w:rPr>
-        <w:t>O(</w:t>
-      </w:r>
-      <w:r>
-        <w:rPr>
-          <w:b/>
-          <w:bCs/>
-          <w:color w:val="000000" w:themeColor="text1"/>
-          <w:sz w:val="22"/>
-          <w:szCs w:val="22"/>
-        </w:rPr>
-        <w:t>n2</w:t>
-      </w:r>
-      <w:r>
-        <w:rPr>
-          <w:b/>
-          <w:bCs/>
-          <w:color w:val="000000" w:themeColor="text1"/>
-          <w:sz w:val="22"/>
-          <w:szCs w:val="22"/>
-        </w:rPr>
-        <w:t>)</w:t>
-      </w:r>
-      <w:r>
-        <w:rPr>
-          <w:b/>
-          <w:bCs/>
-          <w:color w:val="000000" w:themeColor="text1"/>
-          <w:sz w:val="22"/>
-          <w:szCs w:val="22"/>
-        </w:rPr>
-        <w:t xml:space="preserve">: Quadratic </w:t>
-      </w:r>
-    </w:p>
-    <w:p>
-      <w:pPr>
-        <w:rPr>
-          <w:b/>
-          <w:bCs/>
-          <w:color w:val="000000" w:themeColor="text1"/>
-          <w:sz w:val="22"/>
-          <w:szCs w:val="22"/>
-        </w:rPr>
-      </w:pPr>
-      <w:r>
-        <w:rPr>
-          <w:b/>
-          <w:bCs/>
-          <w:color w:val="000000" w:themeColor="text1"/>
-          <w:sz w:val="22"/>
-          <w:szCs w:val="22"/>
-        </w:rPr>
-        <w:t>O(</w:t>
-      </w:r>
-      <w:r>
-        <w:rPr>
-          <w:b/>
-          <w:bCs/>
-          <w:color w:val="000000" w:themeColor="text1"/>
-          <w:sz w:val="22"/>
-          <w:szCs w:val="22"/>
-        </w:rPr>
-        <w:t>2n</w:t>
-      </w:r>
-      <w:r>
-        <w:rPr>
-          <w:b/>
-          <w:bCs/>
-          <w:color w:val="000000" w:themeColor="text1"/>
-          <w:sz w:val="22"/>
-          <w:szCs w:val="22"/>
-        </w:rPr>
-        <w:t>)</w:t>
-      </w:r>
-      <w:r>
-        <w:rPr>
-          <w:b/>
-          <w:bCs/>
-          <w:color w:val="000000" w:themeColor="text1"/>
-          <w:sz w:val="22"/>
-          <w:szCs w:val="22"/>
-        </w:rPr>
-        <w:t xml:space="preserve">: Exponential </w:t>
-      </w:r>
-    </w:p>
-    <w:p>
-      <w:pPr>
-        <w:rPr>
-          <w:b/>
-          <w:bCs/>
-          <w:color w:val="000000" w:themeColor="text1"/>
-          <w:sz w:val="22"/>
-          <w:szCs w:val="22"/>
-        </w:rPr>
-      </w:pPr>
-      <w:r>
-        <w:rPr>
-          <w:b/>
-          <w:bCs/>
-          <w:color w:val="000000" w:themeColor="text1"/>
-          <w:sz w:val="22"/>
-          <w:szCs w:val="22"/>
-        </w:rPr>
-        <w:t>O(</w:t>
-      </w:r>
-      <w:r>
-        <w:rPr>
-          <w:b/>
-          <w:bCs/>
-          <w:color w:val="000000" w:themeColor="text1"/>
-          <w:sz w:val="22"/>
-          <w:szCs w:val="22"/>
-        </w:rPr>
-        <w:t>n!</w:t>
-      </w:r>
-      <w:r>
-        <w:rPr>
-          <w:b/>
-          <w:bCs/>
-          <w:color w:val="000000" w:themeColor="text1"/>
-          <w:sz w:val="22"/>
-          <w:szCs w:val="22"/>
-        </w:rPr>
-        <w:t>)</w:t>
-      </w:r>
-      <w:r>
-        <w:rPr>
-          <w:b/>
-          <w:bCs/>
-          <w:color w:val="000000" w:themeColor="text1"/>
-          <w:sz w:val="22"/>
-          <w:szCs w:val="22"/>
-        </w:rPr>
-        <w:t>: Factorial</w:t>
-      </w:r>
-    </w:p>
-    <w:p>
-      <w:pPr>
-        <w:rPr>
-          <w:color w:val="000000" w:themeColor="text1"/>
-          <w:sz w:val="22"/>
-          <w:szCs w:val="22"/>
-        </w:rPr>
-      </w:pPr>
-    </w:p>
-    <w:p>
-      <w:pPr>
-        <w:rPr>
-          <w:color w:val="000000" w:themeColor="text1"/>
-          <w:sz w:val="22"/>
-          <w:szCs w:val="22"/>
-        </w:rPr>
-      </w:pPr>
+    </w:p>
+    <w:p>
+      <w:pPr>
+        <w:rPr>
+          <w:color w:val="000000" w:themeColor="text1"/>
+          <w:sz w:val="22"/>
+          <w:szCs w:val="22"/>
+        </w:rPr>
+      </w:pPr>
+      <w:r>
+        <w:rPr>
+          <w:color w:val="000000" w:themeColor="text1"/>
+          <w:sz w:val="22"/>
+          <w:szCs w:val="22"/>
+        </w:rPr>
+        <w:t>It works the same as sorting the cards in your hand, we have something called the key. We first split the array into sorted (left) and unsorted (right). We have the key which is the first element of the unsorted half. We then compare it to the left side. And save that value into a key temp. we then shift the values that are greater than the key and insert the key into its place.</w:t>
+      </w:r>
     </w:p>
     <w:sectPr>
       <w:pgSz w:w="12240" w:h="15840"/>
@@ -1172,6 +1250,7 @@
   <w:style w:type="paragraph" w:default="1" w:styleId="Normal">
     <w:name w:val="Normal"/>
     <w:qFormat/>
+    <w:rsid w:val="0019234E"/>
   </w:style>
   <w:style w:type="paragraph" w:styleId="Heading1">
     <w:name w:val="heading 1"/>

</xml_diff>

<commit_message>
add the quick sort notes
</commit_message>
<xml_diff>
--- a/Notes.docx
+++ b/Notes.docx
@@ -181,7 +181,25 @@
           <w:sz w:val="22"/>
           <w:szCs w:val="22"/>
         </w:rPr>
-        <w:t xml:space="preserve"> has complexity of O(n) which means it grows linearly. So if n = 10, it has 10 steps.</w:t>
+        <w:t xml:space="preserve"> has complexity of O(n) which means it grows linearly. </w:t>
+      </w:r>
+      <w:proofErr w:type="gramStart"/>
+      <w:r>
+        <w:rPr>
+          <w:color w:val="000000" w:themeColor="text1"/>
+          <w:sz w:val="22"/>
+          <w:szCs w:val="22"/>
+        </w:rPr>
+        <w:t>So</w:t>
+      </w:r>
+      <w:proofErr w:type="gramEnd"/>
+      <w:r>
+        <w:rPr>
+          <w:color w:val="000000" w:themeColor="text1"/>
+          <w:sz w:val="22"/>
+          <w:szCs w:val="22"/>
+        </w:rPr>
+        <w:t xml:space="preserve"> if n = 10, it has 10 steps.</w:t>
       </w:r>
     </w:p>
     <w:p>
@@ -234,9 +252,28 @@
           <w:sz w:val="22"/>
           <w:szCs w:val="22"/>
         </w:rPr>
-        <w:t xml:space="preserve"> Has complexity of O(log n) which means it grows slower. The idea cannot be implemented unless we are working with a sorted array. The main idea is to have a left most, right most, middle. And target. We calculate the target with (left + right) / 2. And check if this mid is equal to our target. If </w:t>
+        <w:t xml:space="preserve"> Has complexity of </w:t>
+      </w:r>
+      <w:proofErr w:type="gramStart"/>
+      <w:r>
+        <w:rPr>
+          <w:color w:val="000000" w:themeColor="text1"/>
+          <w:sz w:val="22"/>
+          <w:szCs w:val="22"/>
+        </w:rPr>
+        <w:t>O(</w:t>
+      </w:r>
+      <w:proofErr w:type="gramEnd"/>
+      <w:r>
+        <w:rPr>
+          <w:color w:val="000000" w:themeColor="text1"/>
+          <w:sz w:val="22"/>
+          <w:szCs w:val="22"/>
+        </w:rPr>
+        <w:t xml:space="preserve">log n) which means it grows slower. The idea cannot be implemented unless we are working with a sorted array. The main idea is to have a left most, right most, middle. And target. We calculate the target with (left + right) / 2. And check if this mid is equal to our target. If </w:t>
       </w:r>
       <w:proofErr w:type="spellStart"/>
+      <w:proofErr w:type="gramStart"/>
       <w:r>
         <w:rPr>
           <w:color w:val="000000" w:themeColor="text1"/>
@@ -246,13 +283,50 @@
         <w:t>its</w:t>
       </w:r>
       <w:proofErr w:type="spellEnd"/>
-      <w:r>
-        <w:rPr>
-          <w:color w:val="000000" w:themeColor="text1"/>
-          <w:sz w:val="22"/>
-          <w:szCs w:val="22"/>
-        </w:rPr>
-        <w:t xml:space="preserve"> we end the algo. If its smaller than our target, it becomes our left  and our right stays the same. if its greater it becomes our right and our left stays the same and repeat.</w:t>
+      <w:proofErr w:type="gramEnd"/>
+      <w:r>
+        <w:rPr>
+          <w:color w:val="000000" w:themeColor="text1"/>
+          <w:sz w:val="22"/>
+          <w:szCs w:val="22"/>
+        </w:rPr>
+        <w:t xml:space="preserve"> we end the algo. If </w:t>
+      </w:r>
+      <w:proofErr w:type="gramStart"/>
+      <w:r>
+        <w:rPr>
+          <w:color w:val="000000" w:themeColor="text1"/>
+          <w:sz w:val="22"/>
+          <w:szCs w:val="22"/>
+        </w:rPr>
+        <w:t>its</w:t>
+      </w:r>
+      <w:proofErr w:type="gramEnd"/>
+      <w:r>
+        <w:rPr>
+          <w:color w:val="000000" w:themeColor="text1"/>
+          <w:sz w:val="22"/>
+          <w:szCs w:val="22"/>
+        </w:rPr>
+        <w:t xml:space="preserve"> smaller than our target, it becomes our </w:t>
+      </w:r>
+      <w:proofErr w:type="gramStart"/>
+      <w:r>
+        <w:rPr>
+          <w:color w:val="000000" w:themeColor="text1"/>
+          <w:sz w:val="22"/>
+          <w:szCs w:val="22"/>
+        </w:rPr>
+        <w:t>left  and</w:t>
+      </w:r>
+      <w:proofErr w:type="gramEnd"/>
+      <w:r>
+        <w:rPr>
+          <w:color w:val="000000" w:themeColor="text1"/>
+          <w:sz w:val="22"/>
+          <w:szCs w:val="22"/>
+        </w:rPr>
+        <w:t xml:space="preserve"> our right stays the same. if its greater it becomes our right and our left stays the same and repeat.</w:t>
       </w:r>
     </w:p>
     <w:p>
@@ -297,15 +371,27 @@
           <w:szCs w:val="22"/>
         </w:rPr>
       </w:pPr>
-      <w:r>
-        <w:rPr>
-          <w:b/>
-          <w:bCs/>
-          <w:color w:val="000000" w:themeColor="text1"/>
-          <w:sz w:val="22"/>
-          <w:szCs w:val="22"/>
-        </w:rPr>
-        <w:t>O(1)</w:t>
+      <w:proofErr w:type="gramStart"/>
+      <w:r>
+        <w:rPr>
+          <w:b/>
+          <w:bCs/>
+          <w:color w:val="000000" w:themeColor="text1"/>
+          <w:sz w:val="22"/>
+          <w:szCs w:val="22"/>
+        </w:rPr>
+        <w:t>O(</w:t>
+      </w:r>
+      <w:proofErr w:type="gramEnd"/>
+      <w:r>
+        <w:rPr>
+          <w:b/>
+          <w:bCs/>
+          <w:color w:val="000000" w:themeColor="text1"/>
+          <w:sz w:val="22"/>
+          <w:szCs w:val="22"/>
+        </w:rPr>
+        <w:t>1)</w:t>
       </w:r>
       <w:r>
         <w:rPr>
@@ -338,15 +424,27 @@
           <w:szCs w:val="22"/>
         </w:rPr>
       </w:pPr>
-      <w:r>
-        <w:rPr>
-          <w:b/>
-          <w:bCs/>
-          <w:color w:val="000000" w:themeColor="text1"/>
-          <w:sz w:val="22"/>
-          <w:szCs w:val="22"/>
-        </w:rPr>
-        <w:t>O(log n)</w:t>
+      <w:proofErr w:type="gramStart"/>
+      <w:r>
+        <w:rPr>
+          <w:b/>
+          <w:bCs/>
+          <w:color w:val="000000" w:themeColor="text1"/>
+          <w:sz w:val="22"/>
+          <w:szCs w:val="22"/>
+        </w:rPr>
+        <w:t>O(</w:t>
+      </w:r>
+      <w:proofErr w:type="gramEnd"/>
+      <w:r>
+        <w:rPr>
+          <w:b/>
+          <w:bCs/>
+          <w:color w:val="000000" w:themeColor="text1"/>
+          <w:sz w:val="22"/>
+          <w:szCs w:val="22"/>
+        </w:rPr>
+        <w:t>log n)</w:t>
       </w:r>
       <w:r>
         <w:rPr>
@@ -400,15 +498,27 @@
           <w:szCs w:val="22"/>
         </w:rPr>
       </w:pPr>
-      <w:r>
-        <w:rPr>
-          <w:b/>
-          <w:bCs/>
-          <w:color w:val="000000" w:themeColor="text1"/>
-          <w:sz w:val="22"/>
-          <w:szCs w:val="22"/>
-        </w:rPr>
-        <w:t>O(n log n)</w:t>
+      <w:proofErr w:type="gramStart"/>
+      <w:r>
+        <w:rPr>
+          <w:b/>
+          <w:bCs/>
+          <w:color w:val="000000" w:themeColor="text1"/>
+          <w:sz w:val="22"/>
+          <w:szCs w:val="22"/>
+        </w:rPr>
+        <w:t>O(</w:t>
+      </w:r>
+      <w:proofErr w:type="gramEnd"/>
+      <w:r>
+        <w:rPr>
+          <w:b/>
+          <w:bCs/>
+          <w:color w:val="000000" w:themeColor="text1"/>
+          <w:sz w:val="22"/>
+          <w:szCs w:val="22"/>
+        </w:rPr>
+        <w:t>n log n)</w:t>
       </w:r>
       <w:r>
         <w:rPr>
@@ -600,6 +710,7 @@
         <w:t xml:space="preserve"> not time efficient but </w:t>
       </w:r>
       <w:proofErr w:type="spellStart"/>
+      <w:proofErr w:type="gramStart"/>
       <w:r>
         <w:rPr>
           <w:color w:val="000000" w:themeColor="text1"/>
@@ -609,6 +720,7 @@
         <w:t>its</w:t>
       </w:r>
       <w:proofErr w:type="spellEnd"/>
+      <w:proofErr w:type="gramEnd"/>
       <w:r>
         <w:rPr>
           <w:color w:val="000000" w:themeColor="text1"/>
@@ -632,8 +744,27 @@
           <w:sz w:val="22"/>
           <w:szCs w:val="22"/>
         </w:rPr>
-        <w:t>It has the time complexity of O(n</w:t>
-      </w:r>
+        <w:t xml:space="preserve">It has the time complexity of </w:t>
+      </w:r>
+      <w:proofErr w:type="gramStart"/>
+      <w:r>
+        <w:rPr>
+          <w:color w:val="000000" w:themeColor="text1"/>
+          <w:sz w:val="22"/>
+          <w:szCs w:val="22"/>
+        </w:rPr>
+        <w:t>O(</w:t>
+      </w:r>
+      <w:proofErr w:type="gramEnd"/>
+      <w:r>
+        <w:rPr>
+          <w:color w:val="000000" w:themeColor="text1"/>
+          <w:sz w:val="22"/>
+          <w:szCs w:val="22"/>
+        </w:rPr>
+        <w:t>n</w:t>
+      </w:r>
+      <w:proofErr w:type="gramStart"/>
       <w:r>
         <w:rPr>
           <w:color w:val="000000" w:themeColor="text1"/>
@@ -649,7 +780,16 @@
           <w:sz w:val="22"/>
           <w:szCs w:val="22"/>
         </w:rPr>
-        <w:t xml:space="preserve">) </w:t>
+        <w:t>)</w:t>
+      </w:r>
+      <w:proofErr w:type="gramEnd"/>
+      <w:r>
+        <w:rPr>
+          <w:color w:val="000000" w:themeColor="text1"/>
+          <w:sz w:val="22"/>
+          <w:szCs w:val="22"/>
+        </w:rPr>
+        <w:t xml:space="preserve"> </w:t>
       </w:r>
     </w:p>
     <w:p>
@@ -716,8 +856,27 @@
           <w:sz w:val="22"/>
           <w:szCs w:val="22"/>
         </w:rPr>
-        <w:t>It also has the time complexity of O(n</w:t>
-      </w:r>
+        <w:t xml:space="preserve">It also has the time complexity of </w:t>
+      </w:r>
+      <w:proofErr w:type="gramStart"/>
+      <w:r>
+        <w:rPr>
+          <w:color w:val="000000" w:themeColor="text1"/>
+          <w:sz w:val="22"/>
+          <w:szCs w:val="22"/>
+        </w:rPr>
+        <w:t>O(</w:t>
+      </w:r>
+      <w:proofErr w:type="gramEnd"/>
+      <w:r>
+        <w:rPr>
+          <w:color w:val="000000" w:themeColor="text1"/>
+          <w:sz w:val="22"/>
+          <w:szCs w:val="22"/>
+        </w:rPr>
+        <w:t>n</w:t>
+      </w:r>
+      <w:proofErr w:type="gramStart"/>
       <w:r>
         <w:rPr>
           <w:color w:val="000000" w:themeColor="text1"/>
@@ -733,7 +892,16 @@
           <w:sz w:val="22"/>
           <w:szCs w:val="22"/>
         </w:rPr>
-        <w:t xml:space="preserve">) </w:t>
+        <w:t>)</w:t>
+      </w:r>
+      <w:proofErr w:type="gramEnd"/>
+      <w:r>
+        <w:rPr>
+          <w:color w:val="000000" w:themeColor="text1"/>
+          <w:sz w:val="22"/>
+          <w:szCs w:val="22"/>
+        </w:rPr>
+        <w:t xml:space="preserve"> </w:t>
       </w:r>
     </w:p>
     <w:p>
@@ -839,6 +1007,118 @@
         </w:rPr>
         <w:t>It works the same as sorting the cards in your hand, we have something called the key. We first split the array into sorted (left) and unsorted (right). We have the key which is the first element of the unsorted half. We then compare it to the left side. And save that value into a key temp. we then shift the values that are greater than the key and insert the key into its place.</w:t>
       </w:r>
+    </w:p>
+    <w:p>
+      <w:pPr>
+        <w:rPr>
+          <w:color w:val="000000" w:themeColor="text1"/>
+          <w:sz w:val="22"/>
+          <w:szCs w:val="22"/>
+        </w:rPr>
+      </w:pPr>
+    </w:p>
+    <w:p>
+      <w:pPr>
+        <w:jc w:val="center"/>
+        <w:rPr>
+          <w:b/>
+          <w:bCs/>
+          <w:color w:val="EE0000"/>
+          <w:sz w:val="32"/>
+          <w:szCs w:val="32"/>
+          <w:u w:val="single"/>
+        </w:rPr>
+      </w:pPr>
+      <w:r>
+        <w:rPr>
+          <w:b/>
+          <w:bCs/>
+          <w:color w:val="EE0000"/>
+          <w:sz w:val="32"/>
+          <w:szCs w:val="32"/>
+          <w:u w:val="single"/>
+        </w:rPr>
+        <w:t>Quick Sort</w:t>
+      </w:r>
+    </w:p>
+    <w:p>
+      <w:pPr>
+        <w:rPr>
+          <w:color w:val="000000" w:themeColor="text1"/>
+          <w:sz w:val="22"/>
+          <w:szCs w:val="22"/>
+        </w:rPr>
+      </w:pPr>
+      <w:r>
+        <w:rPr>
+          <w:color w:val="000000" w:themeColor="text1"/>
+          <w:sz w:val="22"/>
+          <w:szCs w:val="22"/>
+        </w:rPr>
+        <w:t xml:space="preserve">it has Big </w:t>
+      </w:r>
+      <w:proofErr w:type="gramStart"/>
+      <w:r>
+        <w:rPr>
+          <w:color w:val="000000" w:themeColor="text1"/>
+          <w:sz w:val="22"/>
+          <w:szCs w:val="22"/>
+        </w:rPr>
+        <w:t>O(</w:t>
+      </w:r>
+      <w:proofErr w:type="gramEnd"/>
+      <w:r>
+        <w:rPr>
+          <w:color w:val="000000" w:themeColor="text1"/>
+          <w:sz w:val="22"/>
+          <w:szCs w:val="22"/>
+        </w:rPr>
+        <w:t>n log n)</w:t>
+      </w:r>
+    </w:p>
+    <w:p>
+      <w:pPr>
+        <w:rPr>
+          <w:color w:val="000000" w:themeColor="text1"/>
+          <w:sz w:val="22"/>
+          <w:szCs w:val="22"/>
+        </w:rPr>
+      </w:pPr>
+      <w:r>
+        <w:rPr>
+          <w:color w:val="000000" w:themeColor="text1"/>
+          <w:sz w:val="22"/>
+          <w:szCs w:val="22"/>
+        </w:rPr>
+        <w:t xml:space="preserve">Quick sort is a divide-and-conquer sorting algorithm that works by selecting a pivot element from an array, then rearranging the remaining elements so that everything smaller than the pivot is moved to its left and everything larger is moved to its right; this process is called partitioning and it places the pivot in its final correct sorted position. The algorithm then recursively applies the same strategy to the left and right subarrays until the entire array is sorted. Because each partition step reduces the problem into smaller segments, quick sort is very efficient on average with a time complexity of </w:t>
+      </w:r>
+      <w:proofErr w:type="gramStart"/>
+      <w:r>
+        <w:rPr>
+          <w:color w:val="000000" w:themeColor="text1"/>
+          <w:sz w:val="22"/>
+          <w:szCs w:val="22"/>
+        </w:rPr>
+        <w:t>O(</w:t>
+      </w:r>
+      <w:proofErr w:type="gramEnd"/>
+      <w:r>
+        <w:rPr>
+          <w:color w:val="000000" w:themeColor="text1"/>
+          <w:sz w:val="22"/>
+          <w:szCs w:val="22"/>
+        </w:rPr>
+        <w:t>n log n), though in the worst case—when poor pivot choices lead to highly unbalanced partitions—it degrades to O(n²).</w:t>
+      </w:r>
+    </w:p>
+    <w:p>
+      <w:pPr>
+        <w:rPr>
+          <w:color w:val="000000" w:themeColor="text1"/>
+          <w:sz w:val="22"/>
+          <w:szCs w:val="22"/>
+        </w:rPr>
+      </w:pPr>
     </w:p>
     <w:sectPr>
       <w:pgSz w:w="12240" w:h="15840"/>
@@ -1454,7 +1734,6 @@
   <w:style w:type="character" w:default="1" w:styleId="DefaultParagraphFont">
     <w:name w:val="Default Paragraph Font"/>
     <w:uiPriority w:val="1"/>
-    <w:semiHidden/>
     <w:unhideWhenUsed/>
   </w:style>
   <w:style w:type="table" w:default="1" w:styleId="TableNormal">

</xml_diff>

<commit_message>
add merege sort notes
</commit_message>
<xml_diff>
--- a/Notes.docx
+++ b/Notes.docx
@@ -1159,7 +1159,58 @@
           <w:sz w:val="22"/>
           <w:szCs w:val="22"/>
         </w:rPr>
-        <w:t>Its also divide and conquer technique</w:t>
+        <w:t>It has the time complexity of n log n</w:t>
+      </w:r>
+    </w:p>
+    <w:p>
+      <w:pPr>
+        <w:rPr>
+          <w:color w:val="000000" w:themeColor="text1"/>
+          <w:sz w:val="22"/>
+          <w:szCs w:val="22"/>
+        </w:rPr>
+      </w:pPr>
+      <w:r>
+        <w:rPr>
+          <w:color w:val="000000" w:themeColor="text1"/>
+          <w:sz w:val="22"/>
+          <w:szCs w:val="22"/>
+        </w:rPr>
+        <w:t>It works by calculating the median index then dividing the array from this point to the left and mid + 1 till the last index into a new array. We keep doing this until we have a single value per each array.</w:t>
+      </w:r>
+    </w:p>
+    <w:p>
+      <w:pPr>
+        <w:rPr>
+          <w:color w:val="000000" w:themeColor="text1"/>
+          <w:sz w:val="22"/>
+          <w:szCs w:val="22"/>
+        </w:rPr>
+      </w:pPr>
+      <w:r>
+        <w:rPr>
+          <w:color w:val="000000" w:themeColor="text1"/>
+          <w:sz w:val="22"/>
+          <w:szCs w:val="22"/>
+        </w:rPr>
+        <w:t>Then we merge but during this merge we compare the values before each merge, to make sure its sorted and before the last sort we compare each first element with the first element of the other the second for the second and so on until we have one final array that is sorted. We used recursion to keep dividing and to keep splitting.</w:t>
+      </w:r>
+    </w:p>
+    <w:p>
+      <w:pPr>
+        <w:rPr>
+          <w:color w:val="000000" w:themeColor="text1"/>
+          <w:sz w:val="22"/>
+          <w:szCs w:val="22"/>
+        </w:rPr>
+      </w:pPr>
+      <w:r>
+        <w:rPr>
+          <w:color w:val="000000" w:themeColor="text1"/>
+          <w:sz w:val="22"/>
+          <w:szCs w:val="22"/>
+        </w:rPr>
+        <w:t xml:space="preserve">We need to create extra memory while working on it </w:t>
       </w:r>
     </w:p>
     <w:p>

</xml_diff>

<commit_message>
add the tree notes
</commit_message>
<xml_diff>
--- a/Notes.docx
+++ b/Notes.docx
@@ -2479,6 +2479,657 @@
         </w:rPr>
         <w:t xml:space="preserve"> in real-world Java</w:t>
       </w:r>
+    </w:p>
+    <w:p>
+      <w:pPr>
+        <w:rPr>
+          <w:color w:val="000000" w:themeColor="text1"/>
+          <w:sz w:val="22"/>
+          <w:szCs w:val="22"/>
+        </w:rPr>
+      </w:pPr>
+    </w:p>
+    <w:p>
+      <w:pPr>
+        <w:jc w:val="center"/>
+        <w:rPr>
+          <w:b/>
+          <w:bCs/>
+          <w:color w:val="EE0000"/>
+          <w:sz w:val="32"/>
+          <w:szCs w:val="32"/>
+          <w:u w:val="single"/>
+        </w:rPr>
+      </w:pPr>
+      <w:r>
+        <w:rPr>
+          <w:b/>
+          <w:bCs/>
+          <w:color w:val="EE0000"/>
+          <w:sz w:val="32"/>
+          <w:szCs w:val="32"/>
+          <w:u w:val="single"/>
+        </w:rPr>
+        <w:t>Trees &amp; BST</w:t>
+      </w:r>
+    </w:p>
+    <w:p>
+      <w:pPr>
+        <w:rPr>
+          <w:color w:val="000000" w:themeColor="text1"/>
+          <w:sz w:val="22"/>
+          <w:szCs w:val="22"/>
+        </w:rPr>
+      </w:pPr>
+      <w:r>
+        <w:rPr>
+          <w:color w:val="000000" w:themeColor="text1"/>
+          <w:sz w:val="22"/>
+          <w:szCs w:val="22"/>
+        </w:rPr>
+        <w:t xml:space="preserve">Unlike the </w:t>
+      </w:r>
+      <w:proofErr w:type="spellStart"/>
+      <w:r>
+        <w:rPr>
+          <w:color w:val="000000" w:themeColor="text1"/>
+          <w:sz w:val="22"/>
+          <w:szCs w:val="22"/>
+        </w:rPr>
+        <w:t>linkedlist</w:t>
+      </w:r>
+      <w:proofErr w:type="spellEnd"/>
+      <w:r>
+        <w:rPr>
+          <w:color w:val="000000" w:themeColor="text1"/>
+          <w:sz w:val="22"/>
+          <w:szCs w:val="22"/>
+        </w:rPr>
+        <w:t xml:space="preserve">, a tree is a hierarchal data structure. But its still based on nodes. We have a root node, a child node, a parent node, depth of a node </w:t>
+      </w:r>
+      <w:proofErr w:type="gramStart"/>
+      <w:r>
+        <w:rPr>
+          <w:color w:val="000000" w:themeColor="text1"/>
+          <w:sz w:val="22"/>
+          <w:szCs w:val="22"/>
+        </w:rPr>
+        <w:t xml:space="preserve">( </w:t>
+      </w:r>
+      <w:proofErr w:type="spellStart"/>
+      <w:r>
+        <w:rPr>
+          <w:color w:val="000000" w:themeColor="text1"/>
+          <w:sz w:val="22"/>
+          <w:szCs w:val="22"/>
+        </w:rPr>
+        <w:t>its</w:t>
+      </w:r>
+      <w:proofErr w:type="spellEnd"/>
+      <w:proofErr w:type="gramEnd"/>
+      <w:r>
+        <w:rPr>
+          <w:color w:val="000000" w:themeColor="text1"/>
+          <w:sz w:val="22"/>
+          <w:szCs w:val="22"/>
+        </w:rPr>
+        <w:t xml:space="preserve"> how many nodes from the root until the very specific node) and the tree height which is how many nodes from the root till the last leaf. A leaf node is a node with no children but has parent/s.</w:t>
+      </w:r>
+    </w:p>
+    <w:p>
+      <w:pPr>
+        <w:rPr>
+          <w:color w:val="000000" w:themeColor="text1"/>
+          <w:sz w:val="22"/>
+          <w:szCs w:val="22"/>
+        </w:rPr>
+      </w:pPr>
+      <w:r>
+        <w:rPr>
+          <w:color w:val="000000" w:themeColor="text1"/>
+          <w:sz w:val="22"/>
+          <w:szCs w:val="22"/>
+        </w:rPr>
+        <w:t xml:space="preserve">For a normal non-binary </w:t>
+      </w:r>
+      <w:proofErr w:type="gramStart"/>
+      <w:r>
+        <w:rPr>
+          <w:color w:val="000000" w:themeColor="text1"/>
+          <w:sz w:val="22"/>
+          <w:szCs w:val="22"/>
+        </w:rPr>
+        <w:t>tree</w:t>
+      </w:r>
+      <w:proofErr w:type="gramEnd"/>
+      <w:r>
+        <w:rPr>
+          <w:color w:val="000000" w:themeColor="text1"/>
+          <w:sz w:val="22"/>
+          <w:szCs w:val="22"/>
+        </w:rPr>
+        <w:t xml:space="preserve"> the traversal complexity is O(N) and the same for search.</w:t>
+      </w:r>
+    </w:p>
+    <w:p>
+      <w:pPr>
+        <w:rPr>
+          <w:color w:val="000000" w:themeColor="text1"/>
+          <w:sz w:val="22"/>
+          <w:szCs w:val="22"/>
+        </w:rPr>
+      </w:pPr>
+      <w:r>
+        <w:rPr>
+          <w:color w:val="000000" w:themeColor="text1"/>
+          <w:sz w:val="22"/>
+          <w:szCs w:val="22"/>
+        </w:rPr>
+        <w:t xml:space="preserve">Binary tree is a tree where each parent has maximum 2 </w:t>
+      </w:r>
+      <w:proofErr w:type="gramStart"/>
+      <w:r>
+        <w:rPr>
+          <w:color w:val="000000" w:themeColor="text1"/>
+          <w:sz w:val="22"/>
+          <w:szCs w:val="22"/>
+        </w:rPr>
+        <w:t>children</w:t>
+      </w:r>
+      <w:proofErr w:type="gramEnd"/>
+      <w:r>
+        <w:rPr>
+          <w:color w:val="000000" w:themeColor="text1"/>
+          <w:sz w:val="22"/>
+          <w:szCs w:val="22"/>
+        </w:rPr>
+        <w:t xml:space="preserve"> nodes.</w:t>
+      </w:r>
+    </w:p>
+    <w:p>
+      <w:pPr>
+        <w:rPr>
+          <w:color w:val="000000" w:themeColor="text1"/>
+          <w:sz w:val="22"/>
+          <w:szCs w:val="22"/>
+        </w:rPr>
+      </w:pPr>
+      <w:r>
+        <w:rPr>
+          <w:color w:val="000000" w:themeColor="text1"/>
+          <w:sz w:val="22"/>
+          <w:szCs w:val="22"/>
+        </w:rPr>
+        <w:t xml:space="preserve">For binary trees the time complexity of searching, adding, deleting, reading </w:t>
+      </w:r>
+      <w:proofErr w:type="gramStart"/>
+      <w:r>
+        <w:rPr>
+          <w:color w:val="000000" w:themeColor="text1"/>
+          <w:sz w:val="22"/>
+          <w:szCs w:val="22"/>
+        </w:rPr>
+        <w:t>is  O</w:t>
+      </w:r>
+      <w:proofErr w:type="gramEnd"/>
+      <w:r>
+        <w:rPr>
+          <w:color w:val="000000" w:themeColor="text1"/>
+          <w:sz w:val="22"/>
+          <w:szCs w:val="22"/>
+        </w:rPr>
+        <w:t>(Log n) just like binary search.</w:t>
+      </w:r>
+    </w:p>
+    <w:p>
+      <w:pPr>
+        <w:rPr>
+          <w:color w:val="000000" w:themeColor="text1"/>
+          <w:sz w:val="22"/>
+          <w:szCs w:val="22"/>
+        </w:rPr>
+      </w:pPr>
+    </w:p>
+    <w:p>
+      <w:pPr>
+        <w:rPr>
+          <w:color w:val="000000" w:themeColor="text1"/>
+          <w:sz w:val="22"/>
+          <w:szCs w:val="22"/>
+        </w:rPr>
+      </w:pPr>
+      <w:r>
+        <w:rPr>
+          <w:color w:val="000000" w:themeColor="text1"/>
+          <w:sz w:val="22"/>
+          <w:szCs w:val="22"/>
+        </w:rPr>
+        <w:t>A Binary Search Tree is a sorted binary tree with the rule:</w:t>
+      </w:r>
+    </w:p>
+    <w:p>
+      <w:pPr>
+        <w:rPr>
+          <w:color w:val="000000" w:themeColor="text1"/>
+          <w:sz w:val="22"/>
+          <w:szCs w:val="22"/>
+        </w:rPr>
+      </w:pPr>
+      <w:r>
+        <w:rPr>
+          <w:color w:val="000000" w:themeColor="text1"/>
+          <w:sz w:val="22"/>
+          <w:szCs w:val="22"/>
+        </w:rPr>
+        <w:t>Left subtree &lt; Root &lt; Right subtree</w:t>
+      </w:r>
+      <w:r>
+        <w:rPr>
+          <w:color w:val="000000" w:themeColor="text1"/>
+          <w:sz w:val="22"/>
+          <w:szCs w:val="22"/>
+        </w:rPr>
+        <w:t>.</w:t>
+      </w:r>
+    </w:p>
+    <w:p>
+      <w:pPr>
+        <w:rPr>
+          <w:b/>
+          <w:bCs/>
+          <w:color w:val="000000" w:themeColor="text1"/>
+          <w:sz w:val="22"/>
+          <w:szCs w:val="22"/>
+        </w:rPr>
+      </w:pPr>
+      <w:r>
+        <w:rPr>
+          <w:b/>
+          <w:bCs/>
+          <w:color w:val="000000" w:themeColor="text1"/>
+          <w:sz w:val="22"/>
+          <w:szCs w:val="22"/>
+        </w:rPr>
+        <w:t>Time Complexity (Critical for Interviews)</w:t>
+      </w:r>
+    </w:p>
+    <w:tbl>
+      <w:tblPr>
+        <w:tblW w:w="0" w:type="auto"/>
+        <w:tblCellSpacing w:w="15" w:type="dxa"/>
+        <w:tblCellMar>
+          <w:top w:w="15" w:type="dxa"/>
+          <w:left w:w="15" w:type="dxa"/>
+          <w:bottom w:w="15" w:type="dxa"/>
+          <w:right w:w="15" w:type="dxa"/>
+        </w:tblCellMar>
+        <w:tblLook w:val="04A0" w:firstRow="1" w:lastRow="0" w:firstColumn="1" w:lastColumn="0" w:noHBand="0" w:noVBand="1"/>
+      </w:tblPr>
+      <w:tblGrid>
+        <w:gridCol w:w="998"/>
+        <w:gridCol w:w="1269"/>
+        <w:gridCol w:w="1095"/>
+      </w:tblGrid>
+      <w:tr>
+        <w:trPr>
+          <w:tblHeader/>
+          <w:tblCellSpacing w:w="15" w:type="dxa"/>
+        </w:trPr>
+        <w:tc>
+          <w:tcPr>
+            <w:tcW w:w="0" w:type="auto"/>
+            <w:vAlign w:val="center"/>
+            <w:hideMark/>
+          </w:tcPr>
+          <w:p>
+            <w:pPr>
+              <w:rPr>
+                <w:b/>
+                <w:bCs/>
+                <w:color w:val="000000" w:themeColor="text1"/>
+                <w:sz w:val="22"/>
+                <w:szCs w:val="22"/>
+              </w:rPr>
+            </w:pPr>
+            <w:r>
+              <w:rPr>
+                <w:b/>
+                <w:bCs/>
+                <w:color w:val="000000" w:themeColor="text1"/>
+                <w:sz w:val="22"/>
+                <w:szCs w:val="22"/>
+              </w:rPr>
+              <w:t>Operation</w:t>
+            </w:r>
+          </w:p>
+        </w:tc>
+        <w:tc>
+          <w:tcPr>
+            <w:tcW w:w="0" w:type="auto"/>
+            <w:vAlign w:val="center"/>
+            <w:hideMark/>
+          </w:tcPr>
+          <w:p>
+            <w:pPr>
+              <w:rPr>
+                <w:b/>
+                <w:bCs/>
+                <w:color w:val="000000" w:themeColor="text1"/>
+                <w:sz w:val="22"/>
+                <w:szCs w:val="22"/>
+              </w:rPr>
+            </w:pPr>
+            <w:r>
+              <w:rPr>
+                <w:b/>
+                <w:bCs/>
+                <w:color w:val="000000" w:themeColor="text1"/>
+                <w:sz w:val="22"/>
+                <w:szCs w:val="22"/>
+              </w:rPr>
+              <w:t>Average Case</w:t>
+            </w:r>
+          </w:p>
+        </w:tc>
+        <w:tc>
+          <w:tcPr>
+            <w:tcW w:w="0" w:type="auto"/>
+            <w:vAlign w:val="center"/>
+            <w:hideMark/>
+          </w:tcPr>
+          <w:p>
+            <w:pPr>
+              <w:rPr>
+                <w:b/>
+                <w:bCs/>
+                <w:color w:val="000000" w:themeColor="text1"/>
+                <w:sz w:val="22"/>
+                <w:szCs w:val="22"/>
+              </w:rPr>
+            </w:pPr>
+            <w:r>
+              <w:rPr>
+                <w:b/>
+                <w:bCs/>
+                <w:color w:val="000000" w:themeColor="text1"/>
+                <w:sz w:val="22"/>
+                <w:szCs w:val="22"/>
+              </w:rPr>
+              <w:t>Worst Case</w:t>
+            </w:r>
+          </w:p>
+        </w:tc>
+      </w:tr>
+      <w:tr>
+        <w:trPr>
+          <w:tblCellSpacing w:w="15" w:type="dxa"/>
+        </w:trPr>
+        <w:tc>
+          <w:tcPr>
+            <w:tcW w:w="0" w:type="auto"/>
+            <w:vAlign w:val="center"/>
+            <w:hideMark/>
+          </w:tcPr>
+          <w:p>
+            <w:pPr>
+              <w:rPr>
+                <w:color w:val="000000" w:themeColor="text1"/>
+                <w:sz w:val="22"/>
+                <w:szCs w:val="22"/>
+              </w:rPr>
+            </w:pPr>
+            <w:r>
+              <w:rPr>
+                <w:color w:val="000000" w:themeColor="text1"/>
+                <w:sz w:val="22"/>
+                <w:szCs w:val="22"/>
+              </w:rPr>
+              <w:t>Search</w:t>
+            </w:r>
+          </w:p>
+        </w:tc>
+        <w:tc>
+          <w:tcPr>
+            <w:tcW w:w="0" w:type="auto"/>
+            <w:vAlign w:val="center"/>
+            <w:hideMark/>
+          </w:tcPr>
+          <w:p>
+            <w:pPr>
+              <w:rPr>
+                <w:color w:val="000000" w:themeColor="text1"/>
+                <w:sz w:val="22"/>
+                <w:szCs w:val="22"/>
+              </w:rPr>
+            </w:pPr>
+            <w:proofErr w:type="gramStart"/>
+            <w:r>
+              <w:rPr>
+                <w:color w:val="000000" w:themeColor="text1"/>
+                <w:sz w:val="22"/>
+                <w:szCs w:val="22"/>
+              </w:rPr>
+              <w:t>O(</w:t>
+            </w:r>
+            <w:proofErr w:type="gramEnd"/>
+            <w:r>
+              <w:rPr>
+                <w:color w:val="000000" w:themeColor="text1"/>
+                <w:sz w:val="22"/>
+                <w:szCs w:val="22"/>
+              </w:rPr>
+              <w:t>log n)</w:t>
+            </w:r>
+          </w:p>
+        </w:tc>
+        <w:tc>
+          <w:tcPr>
+            <w:tcW w:w="0" w:type="auto"/>
+            <w:vAlign w:val="center"/>
+            <w:hideMark/>
+          </w:tcPr>
+          <w:p>
+            <w:pPr>
+              <w:rPr>
+                <w:color w:val="000000" w:themeColor="text1"/>
+                <w:sz w:val="22"/>
+                <w:szCs w:val="22"/>
+              </w:rPr>
+            </w:pPr>
+            <w:r>
+              <w:rPr>
+                <w:color w:val="000000" w:themeColor="text1"/>
+                <w:sz w:val="22"/>
+                <w:szCs w:val="22"/>
+              </w:rPr>
+              <w:t>O(n)</w:t>
+            </w:r>
+          </w:p>
+        </w:tc>
+      </w:tr>
+      <w:tr>
+        <w:trPr>
+          <w:tblCellSpacing w:w="15" w:type="dxa"/>
+        </w:trPr>
+        <w:tc>
+          <w:tcPr>
+            <w:tcW w:w="0" w:type="auto"/>
+            <w:vAlign w:val="center"/>
+            <w:hideMark/>
+          </w:tcPr>
+          <w:p>
+            <w:pPr>
+              <w:rPr>
+                <w:color w:val="000000" w:themeColor="text1"/>
+                <w:sz w:val="22"/>
+                <w:szCs w:val="22"/>
+              </w:rPr>
+            </w:pPr>
+            <w:r>
+              <w:rPr>
+                <w:color w:val="000000" w:themeColor="text1"/>
+                <w:sz w:val="22"/>
+                <w:szCs w:val="22"/>
+              </w:rPr>
+              <w:t>Insert</w:t>
+            </w:r>
+          </w:p>
+        </w:tc>
+        <w:tc>
+          <w:tcPr>
+            <w:tcW w:w="0" w:type="auto"/>
+            <w:vAlign w:val="center"/>
+            <w:hideMark/>
+          </w:tcPr>
+          <w:p>
+            <w:pPr>
+              <w:rPr>
+                <w:color w:val="000000" w:themeColor="text1"/>
+                <w:sz w:val="22"/>
+                <w:szCs w:val="22"/>
+              </w:rPr>
+            </w:pPr>
+            <w:proofErr w:type="gramStart"/>
+            <w:r>
+              <w:rPr>
+                <w:color w:val="000000" w:themeColor="text1"/>
+                <w:sz w:val="22"/>
+                <w:szCs w:val="22"/>
+              </w:rPr>
+              <w:t>O(</w:t>
+            </w:r>
+            <w:proofErr w:type="gramEnd"/>
+            <w:r>
+              <w:rPr>
+                <w:color w:val="000000" w:themeColor="text1"/>
+                <w:sz w:val="22"/>
+                <w:szCs w:val="22"/>
+              </w:rPr>
+              <w:t>log n)</w:t>
+            </w:r>
+          </w:p>
+        </w:tc>
+        <w:tc>
+          <w:tcPr>
+            <w:tcW w:w="0" w:type="auto"/>
+            <w:vAlign w:val="center"/>
+            <w:hideMark/>
+          </w:tcPr>
+          <w:p>
+            <w:pPr>
+              <w:rPr>
+                <w:color w:val="000000" w:themeColor="text1"/>
+                <w:sz w:val="22"/>
+                <w:szCs w:val="22"/>
+              </w:rPr>
+            </w:pPr>
+            <w:r>
+              <w:rPr>
+                <w:color w:val="000000" w:themeColor="text1"/>
+                <w:sz w:val="22"/>
+                <w:szCs w:val="22"/>
+              </w:rPr>
+              <w:t>O(n)</w:t>
+            </w:r>
+          </w:p>
+        </w:tc>
+      </w:tr>
+      <w:tr>
+        <w:trPr>
+          <w:tblCellSpacing w:w="15" w:type="dxa"/>
+        </w:trPr>
+        <w:tc>
+          <w:tcPr>
+            <w:tcW w:w="0" w:type="auto"/>
+            <w:vAlign w:val="center"/>
+            <w:hideMark/>
+          </w:tcPr>
+          <w:p>
+            <w:pPr>
+              <w:rPr>
+                <w:color w:val="000000" w:themeColor="text1"/>
+                <w:sz w:val="22"/>
+                <w:szCs w:val="22"/>
+              </w:rPr>
+            </w:pPr>
+            <w:r>
+              <w:rPr>
+                <w:color w:val="000000" w:themeColor="text1"/>
+                <w:sz w:val="22"/>
+                <w:szCs w:val="22"/>
+              </w:rPr>
+              <w:t>Delete</w:t>
+            </w:r>
+          </w:p>
+        </w:tc>
+        <w:tc>
+          <w:tcPr>
+            <w:tcW w:w="0" w:type="auto"/>
+            <w:vAlign w:val="center"/>
+            <w:hideMark/>
+          </w:tcPr>
+          <w:p>
+            <w:pPr>
+              <w:rPr>
+                <w:color w:val="000000" w:themeColor="text1"/>
+                <w:sz w:val="22"/>
+                <w:szCs w:val="22"/>
+              </w:rPr>
+            </w:pPr>
+            <w:proofErr w:type="gramStart"/>
+            <w:r>
+              <w:rPr>
+                <w:color w:val="000000" w:themeColor="text1"/>
+                <w:sz w:val="22"/>
+                <w:szCs w:val="22"/>
+              </w:rPr>
+              <w:t>O(</w:t>
+            </w:r>
+            <w:proofErr w:type="gramEnd"/>
+            <w:r>
+              <w:rPr>
+                <w:color w:val="000000" w:themeColor="text1"/>
+                <w:sz w:val="22"/>
+                <w:szCs w:val="22"/>
+              </w:rPr>
+              <w:t>log n)</w:t>
+            </w:r>
+          </w:p>
+        </w:tc>
+        <w:tc>
+          <w:tcPr>
+            <w:tcW w:w="0" w:type="auto"/>
+            <w:vAlign w:val="center"/>
+            <w:hideMark/>
+          </w:tcPr>
+          <w:p>
+            <w:pPr>
+              <w:rPr>
+                <w:color w:val="000000" w:themeColor="text1"/>
+                <w:sz w:val="22"/>
+                <w:szCs w:val="22"/>
+              </w:rPr>
+            </w:pPr>
+            <w:r>
+              <w:rPr>
+                <w:color w:val="000000" w:themeColor="text1"/>
+                <w:sz w:val="22"/>
+                <w:szCs w:val="22"/>
+              </w:rPr>
+              <w:t>O(n)</w:t>
+            </w:r>
+          </w:p>
+        </w:tc>
+      </w:tr>
+    </w:tbl>
+    <w:p>
+      <w:pPr>
+        <w:rPr>
+          <w:color w:val="000000" w:themeColor="text1"/>
+          <w:sz w:val="22"/>
+          <w:szCs w:val="22"/>
+        </w:rPr>
+      </w:pPr>
     </w:p>
     <w:p>
       <w:pPr>
@@ -3541,7 +4192,6 @@
     <w:next w:val="Normal"/>
     <w:link w:val="Heading2Char"/>
     <w:uiPriority w:val="9"/>
-    <w:semiHidden/>
     <w:unhideWhenUsed/>
     <w:qFormat/>
     <w:rsid w:val="004B0806"/>
@@ -3756,7 +4406,6 @@
     <w:basedOn w:val="DefaultParagraphFont"/>
     <w:link w:val="Heading2"/>
     <w:uiPriority w:val="9"/>
-    <w:semiHidden/>
     <w:rsid w:val="004B0806"/>
     <w:rPr>
       <w:rFonts w:asciiTheme="majorHAnsi" w:eastAsiaTheme="majorEastAsia" w:hAnsiTheme="majorHAnsi" w:cstheme="majorBidi"/>

</xml_diff>